<commit_message>
Fill legal entity details (mentions légales + Phase 2 doc)
Add the registered company information to the legal notice and the Phase 2
affiliations identity sheet: enterprise/VAT number BE 1016.978.286, sole
proprietorship, seat at Chaussée de Stockel 406, 1150 Woluwe-Saint-Pierre.

Co-Authored-By: Claude Opus 4.8 <noreply@anthropic.com>
Claude-Session: https://claude.ai/code/session_011fuZcujE9mvwPashUw5FQ4
</commit_message>
<xml_diff>
--- a/filon-backend/docs/FILON_Phase2_Affiliations.docx
+++ b/filon-backend/docs/FILON_Phase2_Affiliations.docx
@@ -878,7 +878,7 @@
                 <w:sz w:val="19"/>
                 <w:szCs w:val="19"/>
               </w:rPr>
-              <w:t xml:space="preserve">Numéro d'entreprise BCE et numéro de TVA (Belgique). Dénomination, forme juridique, adresse du siège.</w:t>
+              <w:t xml:space="preserve">BE 1016.978.286 (BCE et TVA). Entreprise individuelle, Chaussée de Stockel 406, 1150 Woluwe-Saint-Pierre.</w:t>
             </w:r>
           </w:p>
         </w:tc>
@@ -902,7 +902,7 @@
                 <w:sz w:val="19"/>
                 <w:szCs w:val="19"/>
               </w:rPr>
-              <w:t xml:space="preserve">À compléter</w:t>
+              <w:t xml:space="preserve">OK</w:t>
             </w:r>
           </w:p>
         </w:tc>
@@ -1630,7 +1630,7 @@
                 <w:sz w:val="19"/>
                 <w:szCs w:val="19"/>
               </w:rPr>
-              <w:t xml:space="preserve">[ à compléter ]</w:t>
+              <w:t xml:space="preserve">Freddy Mvogo Eloundou (entreprise individuelle)</w:t>
             </w:r>
           </w:p>
         </w:tc>
@@ -1680,7 +1680,7 @@
                 <w:sz w:val="19"/>
                 <w:szCs w:val="19"/>
               </w:rPr>
-              <w:t xml:space="preserve">[ à compléter ]</w:t>
+              <w:t xml:space="preserve">BE 1016.978.286</w:t>
             </w:r>
           </w:p>
         </w:tc>
@@ -1730,7 +1730,7 @@
                 <w:sz w:val="19"/>
                 <w:szCs w:val="19"/>
               </w:rPr>
-              <w:t xml:space="preserve">[ à compléter ]</w:t>
+              <w:t xml:space="preserve">BE 1016.978.286</w:t>
             </w:r>
           </w:p>
         </w:tc>
@@ -1780,7 +1780,7 @@
                 <w:sz w:val="19"/>
                 <w:szCs w:val="19"/>
               </w:rPr>
-              <w:t xml:space="preserve">[ à compléter ] — Bruxelles, Belgique</w:t>
+              <w:t xml:space="preserve">Chaussée de Stockel 406, 1150 Woluwe-Saint-Pierre, Belgique</w:t>
             </w:r>
           </w:p>
         </w:tc>

</xml_diff>

<commit_message>
Add bank details to Phase 2 affiliations identity sheet
Complete the editor identity sheet with the account holder, bank (bunq),
IBAN and BIC so affiliate networks can be set up with payout details.
Internal document only (filon-backend/docs/); not published on the site.

Co-Authored-By: Claude Opus 4.8 <noreply@anthropic.com>
Claude-Session: https://claude.ai/code/session_011fuZcujE9mvwPashUw5FQ4
</commit_message>
<xml_diff>
--- a/filon-backend/docs/FILON_Phase2_Affiliations.docx
+++ b/filon-backend/docs/FILON_Phase2_Affiliations.docx
@@ -952,7 +952,7 @@
                 <w:sz w:val="19"/>
                 <w:szCs w:val="19"/>
               </w:rPr>
-              <w:t xml:space="preserve">IBAN + BIC au nom de l'entité, pour recevoir les paiements de commission.</w:t>
+              <w:t xml:space="preserve">IBAN NL44 BUNQ 2201 4637 43 · BIC BUNQNL2A (bunq), au nom de Freddy Mvogo Eloundou.</w:t>
             </w:r>
           </w:p>
         </w:tc>
@@ -976,7 +976,7 @@
                 <w:sz w:val="19"/>
                 <w:szCs w:val="19"/>
               </w:rPr>
-              <w:t xml:space="preserve">À compléter</w:t>
+              <w:t xml:space="preserve">OK</w:t>
             </w:r>
           </w:p>
         </w:tc>
@@ -2106,7 +2106,7 @@
                 <w:sz w:val="19"/>
                 <w:szCs w:val="19"/>
               </w:rPr>
-              <w:t xml:space="preserve">IBAN / BIC</w:t>
+              <w:t xml:space="preserve">Titulaire du compte</w:t>
             </w:r>
           </w:p>
         </w:tc>
@@ -2130,7 +2130,7 @@
                 <w:sz w:val="19"/>
                 <w:szCs w:val="19"/>
               </w:rPr>
-              <w:t xml:space="preserve">[ à compléter ]</w:t>
+              <w:t xml:space="preserve">Freddy MVOGO ELOUNDOU</w:t>
             </w:r>
           </w:p>
         </w:tc>
@@ -2156,6 +2156,156 @@
                 <w:sz w:val="19"/>
                 <w:szCs w:val="19"/>
               </w:rPr>
+              <w:t xml:space="preserve">Banque</w:t>
+            </w:r>
+          </w:p>
+        </w:tc>
+        <w:tc>
+          <w:tcPr>
+            <w:tcW w:type="dxa" w:w="5820"/>
+            <w:shd w:fill="EEF3F8" w:color="auto" w:val="clear"/>
+            <w:tcMar>
+              <w:top w:type="dxa" w:w="60"/>
+              <w:left w:type="dxa" w:w="90"/>
+              <w:bottom w:type="dxa" w:w="60"/>
+              <w:right w:type="dxa" w:w="90"/>
+            </w:tcMar>
+          </w:tcPr>
+          <w:p>
+            <w:pPr>
+              <w:spacing w:after="40" w:line="252"/>
+            </w:pPr>
+            <w:r>
+              <w:rPr>
+                <w:sz w:val="19"/>
+                <w:szCs w:val="19"/>
+              </w:rPr>
+              <w:t xml:space="preserve">bunq</w:t>
+            </w:r>
+          </w:p>
+        </w:tc>
+      </w:tr>
+      <w:tr>
+        <w:tc>
+          <w:tcPr>
+            <w:tcW w:type="dxa" w:w="3200"/>
+            <w:shd w:fill="FFFFFF" w:color="auto" w:val="clear"/>
+            <w:tcMar>
+              <w:top w:type="dxa" w:w="60"/>
+              <w:left w:type="dxa" w:w="90"/>
+              <w:bottom w:type="dxa" w:w="60"/>
+              <w:right w:type="dxa" w:w="90"/>
+            </w:tcMar>
+          </w:tcPr>
+          <w:p>
+            <w:pPr>
+              <w:spacing w:after="40" w:line="252"/>
+            </w:pPr>
+            <w:r>
+              <w:rPr>
+                <w:sz w:val="19"/>
+                <w:szCs w:val="19"/>
+              </w:rPr>
+              <w:t xml:space="preserve">IBAN</w:t>
+            </w:r>
+          </w:p>
+        </w:tc>
+        <w:tc>
+          <w:tcPr>
+            <w:tcW w:type="dxa" w:w="5820"/>
+            <w:shd w:fill="FFFFFF" w:color="auto" w:val="clear"/>
+            <w:tcMar>
+              <w:top w:type="dxa" w:w="60"/>
+              <w:left w:type="dxa" w:w="90"/>
+              <w:bottom w:type="dxa" w:w="60"/>
+              <w:right w:type="dxa" w:w="90"/>
+            </w:tcMar>
+          </w:tcPr>
+          <w:p>
+            <w:pPr>
+              <w:spacing w:after="40" w:line="252"/>
+            </w:pPr>
+            <w:r>
+              <w:rPr>
+                <w:sz w:val="19"/>
+                <w:szCs w:val="19"/>
+              </w:rPr>
+              <w:t xml:space="preserve">NL44 BUNQ 2201 4637 43</w:t>
+            </w:r>
+          </w:p>
+        </w:tc>
+      </w:tr>
+      <w:tr>
+        <w:tc>
+          <w:tcPr>
+            <w:tcW w:type="dxa" w:w="3200"/>
+            <w:shd w:fill="EEF3F8" w:color="auto" w:val="clear"/>
+            <w:tcMar>
+              <w:top w:type="dxa" w:w="60"/>
+              <w:left w:type="dxa" w:w="90"/>
+              <w:bottom w:type="dxa" w:w="60"/>
+              <w:right w:type="dxa" w:w="90"/>
+            </w:tcMar>
+          </w:tcPr>
+          <w:p>
+            <w:pPr>
+              <w:spacing w:after="40" w:line="252"/>
+            </w:pPr>
+            <w:r>
+              <w:rPr>
+                <w:sz w:val="19"/>
+                <w:szCs w:val="19"/>
+              </w:rPr>
+              <w:t xml:space="preserve">BIC / SWIFT</w:t>
+            </w:r>
+          </w:p>
+        </w:tc>
+        <w:tc>
+          <w:tcPr>
+            <w:tcW w:type="dxa" w:w="5820"/>
+            <w:shd w:fill="EEF3F8" w:color="auto" w:val="clear"/>
+            <w:tcMar>
+              <w:top w:type="dxa" w:w="60"/>
+              <w:left w:type="dxa" w:w="90"/>
+              <w:bottom w:type="dxa" w:w="60"/>
+              <w:right w:type="dxa" w:w="90"/>
+            </w:tcMar>
+          </w:tcPr>
+          <w:p>
+            <w:pPr>
+              <w:spacing w:after="40" w:line="252"/>
+            </w:pPr>
+            <w:r>
+              <w:rPr>
+                <w:sz w:val="19"/>
+                <w:szCs w:val="19"/>
+              </w:rPr>
+              <w:t xml:space="preserve">BUNQNL2A (forme internationale : BUNQNL2AXXX)</w:t>
+            </w:r>
+          </w:p>
+        </w:tc>
+      </w:tr>
+      <w:tr>
+        <w:tc>
+          <w:tcPr>
+            <w:tcW w:type="dxa" w:w="3200"/>
+            <w:shd w:fill="FFFFFF" w:color="auto" w:val="clear"/>
+            <w:tcMar>
+              <w:top w:type="dxa" w:w="60"/>
+              <w:left w:type="dxa" w:w="90"/>
+              <w:bottom w:type="dxa" w:w="60"/>
+              <w:right w:type="dxa" w:w="90"/>
+            </w:tcMar>
+          </w:tcPr>
+          <w:p>
+            <w:pPr>
+              <w:spacing w:after="40" w:line="252"/>
+            </w:pPr>
+            <w:r>
+              <w:rPr>
+                <w:sz w:val="19"/>
+                <w:szCs w:val="19"/>
+              </w:rPr>
               <w:t xml:space="preserve">Méthodes de promotion</w:t>
             </w:r>
           </w:p>
@@ -2163,7 +2313,7 @@
         <w:tc>
           <w:tcPr>
             <w:tcW w:type="dxa" w:w="5820"/>
-            <w:shd w:fill="EEF3F8" w:color="auto" w:val="clear"/>
+            <w:shd w:fill="FFFFFF" w:color="auto" w:val="clear"/>
             <w:tcMar>
               <w:top w:type="dxa" w:w="60"/>
               <w:left w:type="dxa" w:w="90"/>

</xml_diff>

<commit_message>
Update legal entity to the active registered enterprise
Freddy's enterprise/VAT number is no longer active. Switch the legal editor
identity across the site to the active Belgian sole proprietorship
(Ricardo Aimon, BCE/VAT BE 0797.756.902), so nothing invalid is presented to
affiliate networks. Keep Freddy as the marketing founder.

- Add dedicated legal fields (legalName, legalForm, bce, vat, legalAddress)
  to site config; drive mentions légales, confidentialité and CGU from them.
- Update the Phase 2 affiliations identity sheet to the same entity.

Co-Authored-By: Claude Opus 4.8 <noreply@anthropic.com>
Claude-Session: https://claude.ai/code/session_011fuZcujE9mvwPashUw5FQ4
</commit_message>
<xml_diff>
--- a/filon-backend/docs/FILON_Phase2_Affiliations.docx
+++ b/filon-backend/docs/FILON_Phase2_Affiliations.docx
@@ -878,7 +878,7 @@
                 <w:sz w:val="19"/>
                 <w:szCs w:val="19"/>
               </w:rPr>
-              <w:t xml:space="preserve">BE 1016.978.286 (BCE et TVA). Entreprise individuelle, Chaussée de Stockel 406, 1150 Woluwe-Saint-Pierre.</w:t>
+              <w:t xml:space="preserve">Ricardo Aimon, entreprise individuelle. BCE et TVA : BE 0797.756.902 (actif).</w:t>
             </w:r>
           </w:p>
         </w:tc>
@@ -1630,7 +1630,7 @@
                 <w:sz w:val="19"/>
                 <w:szCs w:val="19"/>
               </w:rPr>
-              <w:t xml:space="preserve">Freddy Mvogo Eloundou (entreprise individuelle)</w:t>
+              <w:t xml:space="preserve">Ricardo Aimon (entreprise individuelle, personne physique)</w:t>
             </w:r>
           </w:p>
         </w:tc>
@@ -1680,7 +1680,7 @@
                 <w:sz w:val="19"/>
                 <w:szCs w:val="19"/>
               </w:rPr>
-              <w:t xml:space="preserve">BE 1016.978.286</w:t>
+              <w:t xml:space="preserve">BE 0797.756.902</w:t>
             </w:r>
           </w:p>
         </w:tc>
@@ -1730,7 +1730,7 @@
                 <w:sz w:val="19"/>
                 <w:szCs w:val="19"/>
               </w:rPr>
-              <w:t xml:space="preserve">BE 1016.978.286</w:t>
+              <w:t xml:space="preserve">BE 0797.756.902</w:t>
             </w:r>
           </w:p>
         </w:tc>

</xml_diff>

<commit_message>
Route all contact to the live contact@ mailbox; real form fallback
Only contact@filon.be exists as a mailbox, so consolidate every site email
link (partenaires@, presse@, jobs@, securite@) onto contact@ to avoid bounces.
Make the contact and newsletter forms fall back to a mailto: to contact@ when
no Formspree endpoint is set, instead of silently faking success. Align the
Phase 2 doc's contact address to contact@ as well.

Co-Authored-By: Claude Opus 4.8 <noreply@anthropic.com>
Claude-Session: https://claude.ai/code/session_011fuZcujE9mvwPashUw5FQ4
</commit_message>
<xml_diff>
--- a/filon-backend/docs/FILON_Phase2_Affiliations.docx
+++ b/filon-backend/docs/FILON_Phase2_Affiliations.docx
@@ -1174,7 +1174,7 @@
                 <w:sz w:val="19"/>
                 <w:szCs w:val="19"/>
               </w:rPr>
-              <w:t xml:space="preserve">contact@filon.be, partenaires@filon.be, presse@filon.be (évite les adresses gmail pour les candidatures).</w:t>
+              <w:t xml:space="preserve">contact@filon.be (créé, actif). Utiliser cette adresse pour toutes les candidatures ; éviter les adresses gmail.</w:t>
             </w:r>
           </w:p>
         </w:tc>
@@ -1198,7 +1198,7 @@
                 <w:sz w:val="19"/>
                 <w:szCs w:val="19"/>
               </w:rPr>
-              <w:t xml:space="preserve">À vérifier</w:t>
+              <w:t xml:space="preserve">OK</w:t>
             </w:r>
           </w:p>
         </w:tc>
@@ -2030,7 +2030,7 @@
                 <w:sz w:val="19"/>
                 <w:szCs w:val="19"/>
               </w:rPr>
-              <w:t xml:space="preserve">partenaires@filon.be</w:t>
+              <w:t xml:space="preserve">contact@filon.be</w:t>
             </w:r>
           </w:p>
         </w:tc>
@@ -6993,7 +6993,7 @@
                 <w:sz w:val="19"/>
                 <w:szCs w:val="19"/>
               </w:rPr>
-              <w:t xml:space="preserve">iGraal, Poulpeo, Widilo, Joko, eBuyClub. Ce sont des sources comparées par FILON et de futurs partenaires. Prise de contact commerciale (partenaires@filon.be) plutôt qu'inscription éditeur classique. À traiter après les réseaux.</w:t>
+              <w:t xml:space="preserve">iGraal, Poulpeo, Widilo, Joko, eBuyClub. Ce sont des sources comparées par FILON et de futurs partenaires. Prise de contact commerciale (contact@filon.be) plutôt qu'inscription éditeur classique. À traiter après les réseaux.</w:t>
             </w:r>
           </w:p>
         </w:tc>
@@ -7194,7 +7194,7 @@
                 <w:sz w:val="19"/>
                 <w:szCs w:val="19"/>
               </w:rPr>
-              <w:t xml:space="preserve">Freddy Mvogo Eloundou — FILON — partenaires@filon.be</w:t>
+              <w:t xml:space="preserve">Freddy Mvogo Eloundou — FILON — contact@filon.be</w:t>
             </w:r>
           </w:p>
         </w:tc>
@@ -10552,7 +10552,7 @@
           <w:sz w:val="18"/>
           <w:szCs w:val="18"/>
         </w:rPr>
-        <w:t xml:space="preserve">Fin du document — FILON, Phase 2. Toute question : partenaires@filon.be</w:t>
+        <w:t xml:space="preserve">Fin du document — FILON, Phase 2. Toute question : contact@filon.be</w:t>
       </w:r>
     </w:p>
     <w:sectPr>

</xml_diff>